<commit_message>
Cambio obligatorio de contrasena tras un restablecimiento, script de recuperacion del administrador y manuales actualizados
Al restablecer una clave el usuario queda obligado a elegir una propia al iniciar sesion (FrmLogin). Se agrega Scripts/05_Recuperar_Administrador.sql, el apartado 10.9 del manual de instalacion, el instalador 1.0.1 y las pruebas correspondientes.

Co-Authored-By: Claude Sonnet 5.5 <noreply@anthropic.com>
</commit_message>
<xml_diff>
--- a/8 - Codigo Fuente/Edelstahl-ERP/Documentacion/Manuales/Manual-de-instalacion.docx
+++ b/8 - Codigo Fuente/Edelstahl-ERP/Documentacion/Manuales/Manual-de-instalacion.docx
@@ -1441,6 +1441,35 @@
             <w:szCs w:val="22"/>
           </w:rPr>
           <w:t>10.8. No puedo abrir el archivo de respaldo (.bak)</w:t>
+        </w:r>
+      </w:hyperlink>
+    </w:p>
+    <w:p>
+      <w:pPr>
+        <w:numPr>
+          <w:ilvl w:val="0"/>
+          <w:numId w:val="1"/>
+        </w:numPr>
+        <w:spacing w:before="15" w:after="15"/>
+        <w:ind w:left="1140"/>
+        <w:divId w:val="1001159149"/>
+        <w:rPr>
+          <w:rFonts w:ascii="Calibri" w:eastAsia="Times New Roman" w:hAnsi="Calibri" w:cs="Calibri"/>
+          <w:color w:val="1C2430"/>
+          <w:sz w:val="22"/>
+          <w:szCs w:val="22"/>
+        </w:rPr>
+      </w:pPr>
+      <w:hyperlink w:anchor="s_recuperacion" w:history="1">
+        <w:r>
+          <w:rPr>
+            <w:rStyle w:val="Hyperlink"/>
+            <w:rFonts w:ascii="Calibri" w:hAnsi="Calibri" w:cs="Calibri"/>
+            <w:color w:val="1C2430"/>
+            <w:sz w:val="22"/>
+            <w:u w:val="none"/>
+          </w:rPr>
+          <w:t>10.9. Olvidé la contraseña o nadie puede entrar</w:t>
         </w:r>
       </w:hyperlink>
     </w:p>
@@ -3178,6 +3207,7 @@
         <w:rPr>
           <w:color w:val="1C2430"/>
         </w:rPr>
+        <w:lastRenderedPageBreak/>
         <w:t>reg query "HKLM\SOFTWARE\Microsoft\NET Framework Setup\NDP\v4\Full" /v Release</w:t>
       </w:r>
     </w:p>
@@ -4106,6 +4136,7 @@
           <w:noProof/>
           <w:sz w:val="22"/>
         </w:rPr>
+        <w:lastRenderedPageBreak/>
         <w:drawing>
           <wp:inline distT="0" distB="0" distL="0" distR="0" wp14:anchorId="63841163" wp14:editId="22DBD885">
             <wp:extent cx="5397500" cy="1750506"/>
@@ -4920,6 +4951,7 @@
           <w:sz w:val="22"/>
           <w:szCs w:val="22"/>
         </w:rPr>
+        <w:lastRenderedPageBreak/>
         <w:t>El instalador crea un acceso directo en el Escritorio y otro en el menú Inicio, y deja en la carpeta de instalación la aplicación, las bibliotecas, el archivo de configuración, los idiomas, los datos de ejemplo y los scripts.</w:t>
       </w:r>
     </w:p>
@@ -8519,7 +8551,7 @@
           <w:szCs w:val="22"/>
         </w:rPr>
         <w:drawing>
-          <wp:inline distT="0" distB="0" distL="0" distR="0" wp14:anchorId="6142BFF3" wp14:editId="065CCCD8">
+          <wp:inline distT="0" distB="0" distL="0" distR="0" wp14:anchorId="6142BFF3" wp14:editId="5ED61ADE">
             <wp:extent cx="5397500" cy="3078936"/>
             <wp:effectExtent l="0" t="0" r="0" b="7620"/>
             <wp:docPr id="1046379083" name="Picture 1"/>
@@ -10199,6 +10231,420 @@
     </w:p>
     <w:p>
       <w:pPr>
+        <w:pStyle w:val="Heading2"/>
+        <w:rPr>
+          <w:rFonts w:ascii="Calibri" w:eastAsia="Times New Roman" w:hAnsi="Calibri" w:cs="Calibri"/>
+        </w:rPr>
+      </w:pPr>
+      <w:bookmarkStart w:id="0" w:name="s_recuperacion"/>
+      <w:r>
+        <w:rPr>
+          <w:rFonts w:ascii="Calibri" w:eastAsia="Times New Roman" w:hAnsi="Calibri" w:cs="Calibri"/>
+        </w:rPr>
+        <w:t>10.9. Olvidé la contraseña o nadie puede entrar</w:t>
+      </w:r>
+    </w:p>
+    <w:bookmarkEnd w:id="0"/>
+    <w:p>
+      <w:pPr>
+        <w:pStyle w:val="NormalWeb"/>
+        <w:rPr>
+          <w:rFonts w:ascii="Calibri" w:hAnsi="Calibri" w:cs="Calibri"/>
+          <w:color w:val="1C2430"/>
+          <w:sz w:val="22"/>
+          <w:szCs w:val="22"/>
+        </w:rPr>
+      </w:pPr>
+      <w:r>
+        <w:rPr>
+          <w:rFonts w:ascii="Calibri" w:hAnsi="Calibri" w:cs="Calibri"/>
+          <w:b/>
+          <w:bCs/>
+          <w:color w:val="1C2430"/>
+          <w:sz w:val="22"/>
+          <w:szCs w:val="22"/>
+        </w:rPr>
+        <w:t>Causas posibles:</w:t>
+      </w:r>
+    </w:p>
+    <w:p>
+      <w:pPr>
+        <w:numPr>
+          <w:ilvl w:val="0"/>
+          <w:numId w:val="38"/>
+        </w:numPr>
+        <w:spacing w:before="100" w:beforeAutospacing="1" w:after="100" w:afterAutospacing="1"/>
+        <w:ind w:left="1050"/>
+        <w:rPr>
+          <w:rFonts w:ascii="Calibri" w:eastAsia="Times New Roman" w:hAnsi="Calibri" w:cs="Calibri"/>
+          <w:color w:val="1C2430"/>
+          <w:sz w:val="22"/>
+          <w:szCs w:val="22"/>
+        </w:rPr>
+      </w:pPr>
+      <w:r>
+        <w:rPr>
+          <w:rFonts w:ascii="Calibri" w:eastAsia="Times New Roman" w:hAnsi="Calibri" w:cs="Calibri"/>
+          <w:color w:val="1C2430"/>
+          <w:sz w:val="22"/>
+          <w:szCs w:val="22"/>
+        </w:rPr>
+        <w:t>Un usuario olvidó su contraseña.</w:t>
+      </w:r>
+    </w:p>
+    <w:p>
+      <w:pPr>
+        <w:numPr>
+          <w:ilvl w:val="0"/>
+          <w:numId w:val="38"/>
+        </w:numPr>
+        <w:spacing w:before="100" w:beforeAutospacing="1" w:after="100" w:afterAutospacing="1"/>
+        <w:ind w:left="1050"/>
+        <w:rPr>
+          <w:rFonts w:ascii="Calibri" w:eastAsia="Times New Roman" w:hAnsi="Calibri" w:cs="Calibri"/>
+          <w:color w:val="1C2430"/>
+          <w:sz w:val="22"/>
+          <w:szCs w:val="22"/>
+        </w:rPr>
+      </w:pPr>
+      <w:r>
+        <w:rPr>
+          <w:rFonts w:ascii="Calibri" w:eastAsia="Times New Roman" w:hAnsi="Calibri" w:cs="Calibri"/>
+          <w:color w:val="1C2430"/>
+          <w:sz w:val="22"/>
+          <w:szCs w:val="22"/>
+        </w:rPr>
+        <w:t>El único administrador olvidó la suya, y por eso nadie puede restablecerla desde el programa.</w:t>
+      </w:r>
+    </w:p>
+    <w:p>
+      <w:pPr>
+        <w:pStyle w:val="NormalWeb"/>
+        <w:rPr>
+          <w:rFonts w:ascii="Calibri" w:hAnsi="Calibri" w:cs="Calibri"/>
+          <w:color w:val="1C2430"/>
+          <w:sz w:val="22"/>
+          <w:szCs w:val="22"/>
+        </w:rPr>
+      </w:pPr>
+      <w:r>
+        <w:rPr>
+          <w:rFonts w:ascii="Calibri" w:hAnsi="Calibri" w:cs="Calibri"/>
+          <w:b/>
+          <w:bCs/>
+          <w:color w:val="1C2430"/>
+          <w:sz w:val="22"/>
+          <w:szCs w:val="22"/>
+        </w:rPr>
+        <w:t>Solución si olvidó la contraseña un usuario común:</w:t>
+      </w:r>
+    </w:p>
+    <w:p>
+      <w:pPr>
+        <w:pStyle w:val="ListParagraph"/>
+        <w:numPr>
+          <w:ilvl w:val="0"/>
+          <w:numId w:val="45"/>
+        </w:numPr>
+        <w:spacing w:before="100" w:beforeAutospacing="1" w:after="100" w:afterAutospacing="1"/>
+        <w:ind w:left="1050"/>
+        <w:rPr>
+          <w:rFonts w:ascii="Calibri" w:eastAsia="Times New Roman" w:hAnsi="Calibri" w:cs="Calibri"/>
+          <w:color w:val="1C2430"/>
+          <w:sz w:val="22"/>
+          <w:szCs w:val="22"/>
+        </w:rPr>
+      </w:pPr>
+      <w:r>
+        <w:rPr>
+          <w:rFonts w:ascii="Calibri" w:eastAsia="Times New Roman" w:hAnsi="Calibri" w:cs="Calibri"/>
+          <w:color w:val="1C2430"/>
+          <w:sz w:val="22"/>
+          <w:szCs w:val="22"/>
+        </w:rPr>
+        <w:t>Un administrador inicia sesión y abre Administración, pestaña Users.</w:t>
+      </w:r>
+    </w:p>
+    <w:p>
+      <w:pPr>
+        <w:pStyle w:val="ListParagraph"/>
+        <w:numPr>
+          <w:ilvl w:val="0"/>
+          <w:numId w:val="45"/>
+        </w:numPr>
+        <w:spacing w:before="100" w:beforeAutospacing="1" w:after="100" w:afterAutospacing="1"/>
+        <w:ind w:left="1050"/>
+        <w:rPr>
+          <w:rFonts w:ascii="Calibri" w:eastAsia="Times New Roman" w:hAnsi="Calibri" w:cs="Calibri"/>
+          <w:color w:val="1C2430"/>
+          <w:sz w:val="22"/>
+          <w:szCs w:val="22"/>
+        </w:rPr>
+      </w:pPr>
+      <w:r>
+        <w:rPr>
+          <w:rFonts w:ascii="Calibri" w:eastAsia="Times New Roman" w:hAnsi="Calibri" w:cs="Calibri"/>
+          <w:color w:val="1C2430"/>
+          <w:sz w:val="22"/>
+          <w:szCs w:val="22"/>
+        </w:rPr>
+        <w:t>Selecciona al usuario, elige Reset password y escribe una contraseña provisoria dos veces (mínimo 8 caracteres). Esto también quita el bloqueo, si lo tenía.</w:t>
+      </w:r>
+    </w:p>
+    <w:p>
+      <w:pPr>
+        <w:pStyle w:val="ListParagraph"/>
+        <w:numPr>
+          <w:ilvl w:val="0"/>
+          <w:numId w:val="45"/>
+        </w:numPr>
+        <w:spacing w:before="100" w:beforeAutospacing="1" w:after="100" w:afterAutospacing="1"/>
+        <w:ind w:left="1050"/>
+        <w:rPr>
+          <w:rFonts w:ascii="Calibri" w:eastAsia="Times New Roman" w:hAnsi="Calibri" w:cs="Calibri"/>
+          <w:color w:val="1C2430"/>
+          <w:sz w:val="22"/>
+          <w:szCs w:val="22"/>
+        </w:rPr>
+      </w:pPr>
+      <w:r>
+        <w:rPr>
+          <w:rFonts w:ascii="Calibri" w:eastAsia="Times New Roman" w:hAnsi="Calibri" w:cs="Calibri"/>
+          <w:color w:val="1C2430"/>
+          <w:sz w:val="22"/>
+          <w:szCs w:val="22"/>
+        </w:rPr>
+        <w:t>Le informa la contraseña provisoria al usuario.</w:t>
+      </w:r>
+    </w:p>
+    <w:p>
+      <w:pPr>
+        <w:pStyle w:val="ListParagraph"/>
+        <w:numPr>
+          <w:ilvl w:val="0"/>
+          <w:numId w:val="45"/>
+        </w:numPr>
+        <w:spacing w:before="100" w:beforeAutospacing="1" w:after="100" w:afterAutospacing="1"/>
+        <w:ind w:left="1050"/>
+        <w:rPr>
+          <w:rFonts w:ascii="Calibri" w:eastAsia="Times New Roman" w:hAnsi="Calibri" w:cs="Calibri"/>
+          <w:color w:val="1C2430"/>
+          <w:sz w:val="22"/>
+          <w:szCs w:val="22"/>
+        </w:rPr>
+      </w:pPr>
+      <w:r>
+        <w:rPr>
+          <w:rFonts w:ascii="Calibri" w:eastAsia="Times New Roman" w:hAnsi="Calibri" w:cs="Calibri"/>
+          <w:color w:val="1C2430"/>
+          <w:sz w:val="22"/>
+          <w:szCs w:val="22"/>
+        </w:rPr>
+        <w:t>Al iniciar sesión, el programa le pide elegir una contraseña propia. No puede entrar sin elegirla.</w:t>
+      </w:r>
+    </w:p>
+    <w:p>
+      <w:pPr>
+        <w:pStyle w:val="NormalWeb"/>
+        <w:rPr>
+          <w:rFonts w:ascii="Calibri" w:hAnsi="Calibri" w:cs="Calibri"/>
+          <w:color w:val="1C2430"/>
+          <w:sz w:val="22"/>
+          <w:szCs w:val="22"/>
+        </w:rPr>
+      </w:pPr>
+      <w:r>
+        <w:rPr>
+          <w:rFonts w:ascii="Calibri" w:hAnsi="Calibri" w:cs="Calibri"/>
+          <w:b/>
+          <w:bCs/>
+          <w:color w:val="1C2430"/>
+          <w:sz w:val="22"/>
+          <w:szCs w:val="22"/>
+        </w:rPr>
+        <w:t>Solución si olvidó la contraseña el único administrador:</w:t>
+      </w:r>
+    </w:p>
+    <w:p>
+      <w:pPr>
+        <w:pStyle w:val="ListParagraph"/>
+        <w:numPr>
+          <w:ilvl w:val="0"/>
+          <w:numId w:val="46"/>
+        </w:numPr>
+        <w:spacing w:before="100" w:beforeAutospacing="1" w:after="100" w:afterAutospacing="1"/>
+        <w:ind w:left="1050"/>
+        <w:rPr>
+          <w:rFonts w:ascii="Calibri" w:eastAsia="Times New Roman" w:hAnsi="Calibri" w:cs="Calibri"/>
+          <w:color w:val="1C2430"/>
+          <w:sz w:val="22"/>
+          <w:szCs w:val="22"/>
+        </w:rPr>
+      </w:pPr>
+      <w:r>
+        <w:rPr>
+          <w:rFonts w:ascii="Calibri" w:eastAsia="Times New Roman" w:hAnsi="Calibri" w:cs="Calibri"/>
+          <w:color w:val="1C2430"/>
+          <w:sz w:val="22"/>
+          <w:szCs w:val="22"/>
+        </w:rPr>
+        <w:t>Abrí SQL Server Management Studio y conectate a localhost\SQLEXPRESS con autenticación de Windows.</w:t>
+      </w:r>
+    </w:p>
+    <w:p>
+      <w:pPr>
+        <w:pStyle w:val="ListParagraph"/>
+        <w:numPr>
+          <w:ilvl w:val="0"/>
+          <w:numId w:val="46"/>
+        </w:numPr>
+        <w:spacing w:before="100" w:beforeAutospacing="1" w:after="100" w:afterAutospacing="1"/>
+        <w:ind w:left="1050"/>
+        <w:rPr>
+          <w:rFonts w:ascii="Calibri" w:eastAsia="Times New Roman" w:hAnsi="Calibri" w:cs="Calibri"/>
+          <w:color w:val="1C2430"/>
+          <w:sz w:val="22"/>
+          <w:szCs w:val="22"/>
+        </w:rPr>
+      </w:pPr>
+      <w:r>
+        <w:rPr>
+          <w:rFonts w:ascii="Calibri" w:eastAsia="Times New Roman" w:hAnsi="Calibri" w:cs="Calibri"/>
+          <w:color w:val="1C2430"/>
+          <w:sz w:val="22"/>
+          <w:szCs w:val="22"/>
+        </w:rPr>
+        <w:t>Abrí el archivo Scripts\05_Recuperar_Administrador.sql (también está en la carpeta 4 - Base de Datos).</w:t>
+      </w:r>
+    </w:p>
+    <w:p>
+      <w:pPr>
+        <w:pStyle w:val="ListParagraph"/>
+        <w:numPr>
+          <w:ilvl w:val="0"/>
+          <w:numId w:val="46"/>
+        </w:numPr>
+        <w:spacing w:before="100" w:beforeAutospacing="1" w:after="100" w:afterAutospacing="1"/>
+        <w:ind w:left="1050"/>
+        <w:rPr>
+          <w:rFonts w:ascii="Calibri" w:eastAsia="Times New Roman" w:hAnsi="Calibri" w:cs="Calibri"/>
+          <w:color w:val="1C2430"/>
+          <w:sz w:val="22"/>
+          <w:szCs w:val="22"/>
+        </w:rPr>
+      </w:pPr>
+      <w:r>
+        <w:rPr>
+          <w:rFonts w:ascii="Calibri" w:eastAsia="Times New Roman" w:hAnsi="Calibri" w:cs="Calibri"/>
+          <w:color w:val="1C2430"/>
+          <w:sz w:val="22"/>
+          <w:szCs w:val="22"/>
+        </w:rPr>
+        <w:t>Si el administrador no se llama admin, cambiá el nombre en la línea SET @Usuario.</w:t>
+      </w:r>
+    </w:p>
+    <w:p>
+      <w:pPr>
+        <w:pStyle w:val="ListParagraph"/>
+        <w:numPr>
+          <w:ilvl w:val="0"/>
+          <w:numId w:val="46"/>
+        </w:numPr>
+        <w:spacing w:before="100" w:beforeAutospacing="1" w:after="100" w:afterAutospacing="1"/>
+        <w:ind w:left="1050"/>
+        <w:rPr>
+          <w:rFonts w:ascii="Calibri" w:eastAsia="Times New Roman" w:hAnsi="Calibri" w:cs="Calibri"/>
+          <w:color w:val="1C2430"/>
+          <w:sz w:val="22"/>
+          <w:szCs w:val="22"/>
+        </w:rPr>
+      </w:pPr>
+      <w:r>
+        <w:rPr>
+          <w:rFonts w:ascii="Calibri" w:eastAsia="Times New Roman" w:hAnsi="Calibri" w:cs="Calibri"/>
+          <w:color w:val="1C2430"/>
+          <w:sz w:val="22"/>
+          <w:szCs w:val="22"/>
+        </w:rPr>
+        <w:t>Ejecutá el script completo con F5. Tiene que mostrar el mensaje Listo.</w:t>
+      </w:r>
+    </w:p>
+    <w:p>
+      <w:pPr>
+        <w:pStyle w:val="ListParagraph"/>
+        <w:numPr>
+          <w:ilvl w:val="0"/>
+          <w:numId w:val="46"/>
+        </w:numPr>
+        <w:spacing w:before="100" w:beforeAutospacing="1" w:after="100" w:afterAutospacing="1"/>
+        <w:ind w:left="1050"/>
+        <w:rPr>
+          <w:rFonts w:ascii="Calibri" w:eastAsia="Times New Roman" w:hAnsi="Calibri" w:cs="Calibri"/>
+          <w:color w:val="1C2430"/>
+          <w:sz w:val="22"/>
+          <w:szCs w:val="22"/>
+        </w:rPr>
+      </w:pPr>
+      <w:r>
+        <w:rPr>
+          <w:rFonts w:ascii="Calibri" w:eastAsia="Times New Roman" w:hAnsi="Calibri" w:cs="Calibri"/>
+          <w:color w:val="1C2430"/>
+          <w:sz w:val="22"/>
+          <w:szCs w:val="22"/>
+        </w:rPr>
+        <w:t>Abrí el programa, elegí el modo SQL Server e ingresá con ese usuario y la contraseña provisoria Recuperar-2026.</w:t>
+      </w:r>
+    </w:p>
+    <w:p>
+      <w:pPr>
+        <w:pStyle w:val="ListParagraph"/>
+        <w:numPr>
+          <w:ilvl w:val="0"/>
+          <w:numId w:val="46"/>
+        </w:numPr>
+        <w:spacing w:before="100" w:beforeAutospacing="1" w:after="100" w:afterAutospacing="1"/>
+        <w:ind w:left="1050"/>
+        <w:rPr>
+          <w:rFonts w:ascii="Calibri" w:eastAsia="Times New Roman" w:hAnsi="Calibri" w:cs="Calibri"/>
+          <w:color w:val="1C2430"/>
+          <w:sz w:val="22"/>
+          <w:szCs w:val="22"/>
+        </w:rPr>
+      </w:pPr>
+      <w:r>
+        <w:rPr>
+          <w:rFonts w:ascii="Calibri" w:eastAsia="Times New Roman" w:hAnsi="Calibri" w:cs="Calibri"/>
+          <w:color w:val="1C2430"/>
+          <w:sz w:val="22"/>
+          <w:szCs w:val="22"/>
+        </w:rPr>
+        <w:t>El programa pide elegir una contraseña propia: escribila dos veces. Desde ese momento la contraseña provisoria ya no sirve.</w:t>
+      </w:r>
+    </w:p>
+    <w:p>
+      <w:pPr>
+        <w:pStyle w:val="NormalWeb"/>
+        <w:rPr>
+          <w:rFonts w:ascii="Calibri" w:hAnsi="Calibri" w:cs="Calibri"/>
+          <w:color w:val="1C2430"/>
+          <w:sz w:val="22"/>
+          <w:szCs w:val="22"/>
+        </w:rPr>
+      </w:pPr>
+      <w:r>
+        <w:rPr>
+          <w:rFonts w:ascii="Calibri" w:hAnsi="Calibri" w:cs="Calibri"/>
+          <w:b/>
+          <w:bCs/>
+          <w:color w:val="1C2430"/>
+          <w:sz w:val="22"/>
+          <w:szCs w:val="22"/>
+        </w:rPr>
+        <w:t>Recomendación: mantené siempre al menos dos administradores activos, así uno puede restablecer la contraseña del otro sin usar el script.</w:t>
+      </w:r>
+    </w:p>
+    <w:p>
+      <w:pPr>
         <w:pStyle w:val="Heading1"/>
         <w:rPr>
           <w:rFonts w:ascii="Calibri" w:eastAsia="Times New Roman" w:hAnsi="Calibri" w:cs="Calibri"/>
@@ -12446,6 +12892,119 @@
     </w:lvl>
   </w:abstractNum>
   <w:abstractNum w:abstractNumId="11" w15:restartNumberingAfterBreak="0">
+    <w:nsid w:val="32D129A3"/>
+    <w:multiLevelType w:val="multilevel"/>
+    <w:tmpl w:val="8372567E"/>
+    <w:lvl w:ilvl="0">
+      <w:start w:val="1"/>
+      <w:numFmt w:val="decimal"/>
+      <w:lvlText w:val="%1."/>
+      <w:lvlJc w:val="left"/>
+      <w:pPr>
+        <w:tabs>
+          <w:tab w:val="num" w:pos="720"/>
+        </w:tabs>
+        <w:ind w:left="720" w:hanging="360"/>
+      </w:pPr>
+    </w:lvl>
+    <w:lvl w:ilvl="1" w:tentative="1">
+      <w:start w:val="1"/>
+      <w:numFmt w:val="decimal"/>
+      <w:lvlText w:val="%2."/>
+      <w:lvlJc w:val="left"/>
+      <w:pPr>
+        <w:tabs>
+          <w:tab w:val="num" w:pos="1440"/>
+        </w:tabs>
+        <w:ind w:left="1440" w:hanging="360"/>
+      </w:pPr>
+    </w:lvl>
+    <w:lvl w:ilvl="2" w:tentative="1">
+      <w:start w:val="1"/>
+      <w:numFmt w:val="decimal"/>
+      <w:lvlText w:val="%3."/>
+      <w:lvlJc w:val="left"/>
+      <w:pPr>
+        <w:tabs>
+          <w:tab w:val="num" w:pos="2160"/>
+        </w:tabs>
+        <w:ind w:left="2160" w:hanging="360"/>
+      </w:pPr>
+    </w:lvl>
+    <w:lvl w:ilvl="3" w:tentative="1">
+      <w:start w:val="1"/>
+      <w:numFmt w:val="decimal"/>
+      <w:lvlText w:val="%4."/>
+      <w:lvlJc w:val="left"/>
+      <w:pPr>
+        <w:tabs>
+          <w:tab w:val="num" w:pos="2880"/>
+        </w:tabs>
+        <w:ind w:left="2880" w:hanging="360"/>
+      </w:pPr>
+    </w:lvl>
+    <w:lvl w:ilvl="4" w:tentative="1">
+      <w:start w:val="1"/>
+      <w:numFmt w:val="decimal"/>
+      <w:lvlText w:val="%5."/>
+      <w:lvlJc w:val="left"/>
+      <w:pPr>
+        <w:tabs>
+          <w:tab w:val="num" w:pos="3600"/>
+        </w:tabs>
+        <w:ind w:left="3600" w:hanging="360"/>
+      </w:pPr>
+    </w:lvl>
+    <w:lvl w:ilvl="5" w:tentative="1">
+      <w:start w:val="1"/>
+      <w:numFmt w:val="decimal"/>
+      <w:lvlText w:val="%6."/>
+      <w:lvlJc w:val="left"/>
+      <w:pPr>
+        <w:tabs>
+          <w:tab w:val="num" w:pos="4320"/>
+        </w:tabs>
+        <w:ind w:left="4320" w:hanging="360"/>
+      </w:pPr>
+    </w:lvl>
+    <w:lvl w:ilvl="6" w:tentative="1">
+      <w:start w:val="1"/>
+      <w:numFmt w:val="decimal"/>
+      <w:lvlText w:val="%7."/>
+      <w:lvlJc w:val="left"/>
+      <w:pPr>
+        <w:tabs>
+          <w:tab w:val="num" w:pos="5040"/>
+        </w:tabs>
+        <w:ind w:left="5040" w:hanging="360"/>
+      </w:pPr>
+    </w:lvl>
+    <w:lvl w:ilvl="7" w:tentative="1">
+      <w:start w:val="1"/>
+      <w:numFmt w:val="decimal"/>
+      <w:lvlText w:val="%8."/>
+      <w:lvlJc w:val="left"/>
+      <w:pPr>
+        <w:tabs>
+          <w:tab w:val="num" w:pos="5760"/>
+        </w:tabs>
+        <w:ind w:left="5760" w:hanging="360"/>
+      </w:pPr>
+    </w:lvl>
+    <w:lvl w:ilvl="8" w:tentative="1">
+      <w:start w:val="1"/>
+      <w:numFmt w:val="decimal"/>
+      <w:lvlText w:val="%9."/>
+      <w:lvlJc w:val="left"/>
+      <w:pPr>
+        <w:tabs>
+          <w:tab w:val="num" w:pos="6480"/>
+        </w:tabs>
+        <w:ind w:left="6480" w:hanging="360"/>
+      </w:pPr>
+    </w:lvl>
+  </w:abstractNum>
+  <w:abstractNum w:abstractNumId="12" w15:restartNumberingAfterBreak="0">
     <w:nsid w:val="33BE3DEB"/>
     <w:multiLevelType w:val="multilevel"/>
     <w:tmpl w:val="457E7C84"/>
@@ -12594,7 +13153,120 @@
       </w:rPr>
     </w:lvl>
   </w:abstractNum>
-  <w:abstractNum w:abstractNumId="12" w15:restartNumberingAfterBreak="0">
+  <w:abstractNum w:abstractNumId="13" w15:restartNumberingAfterBreak="0">
+    <w:nsid w:val="36730E3D"/>
+    <w:multiLevelType w:val="multilevel"/>
+    <w:tmpl w:val="8372567E"/>
+    <w:lvl w:ilvl="0">
+      <w:start w:val="1"/>
+      <w:numFmt w:val="decimal"/>
+      <w:lvlText w:val="%1."/>
+      <w:lvlJc w:val="left"/>
+      <w:pPr>
+        <w:tabs>
+          <w:tab w:val="num" w:pos="720"/>
+        </w:tabs>
+        <w:ind w:left="720" w:hanging="360"/>
+      </w:pPr>
+    </w:lvl>
+    <w:lvl w:ilvl="1" w:tentative="1">
+      <w:start w:val="1"/>
+      <w:numFmt w:val="decimal"/>
+      <w:lvlText w:val="%2."/>
+      <w:lvlJc w:val="left"/>
+      <w:pPr>
+        <w:tabs>
+          <w:tab w:val="num" w:pos="1440"/>
+        </w:tabs>
+        <w:ind w:left="1440" w:hanging="360"/>
+      </w:pPr>
+    </w:lvl>
+    <w:lvl w:ilvl="2" w:tentative="1">
+      <w:start w:val="1"/>
+      <w:numFmt w:val="decimal"/>
+      <w:lvlText w:val="%3."/>
+      <w:lvlJc w:val="left"/>
+      <w:pPr>
+        <w:tabs>
+          <w:tab w:val="num" w:pos="2160"/>
+        </w:tabs>
+        <w:ind w:left="2160" w:hanging="360"/>
+      </w:pPr>
+    </w:lvl>
+    <w:lvl w:ilvl="3" w:tentative="1">
+      <w:start w:val="1"/>
+      <w:numFmt w:val="decimal"/>
+      <w:lvlText w:val="%4."/>
+      <w:lvlJc w:val="left"/>
+      <w:pPr>
+        <w:tabs>
+          <w:tab w:val="num" w:pos="2880"/>
+        </w:tabs>
+        <w:ind w:left="2880" w:hanging="360"/>
+      </w:pPr>
+    </w:lvl>
+    <w:lvl w:ilvl="4" w:tentative="1">
+      <w:start w:val="1"/>
+      <w:numFmt w:val="decimal"/>
+      <w:lvlText w:val="%5."/>
+      <w:lvlJc w:val="left"/>
+      <w:pPr>
+        <w:tabs>
+          <w:tab w:val="num" w:pos="3600"/>
+        </w:tabs>
+        <w:ind w:left="3600" w:hanging="360"/>
+      </w:pPr>
+    </w:lvl>
+    <w:lvl w:ilvl="5" w:tentative="1">
+      <w:start w:val="1"/>
+      <w:numFmt w:val="decimal"/>
+      <w:lvlText w:val="%6."/>
+      <w:lvlJc w:val="left"/>
+      <w:pPr>
+        <w:tabs>
+          <w:tab w:val="num" w:pos="4320"/>
+        </w:tabs>
+        <w:ind w:left="4320" w:hanging="360"/>
+      </w:pPr>
+    </w:lvl>
+    <w:lvl w:ilvl="6" w:tentative="1">
+      <w:start w:val="1"/>
+      <w:numFmt w:val="decimal"/>
+      <w:lvlText w:val="%7."/>
+      <w:lvlJc w:val="left"/>
+      <w:pPr>
+        <w:tabs>
+          <w:tab w:val="num" w:pos="5040"/>
+        </w:tabs>
+        <w:ind w:left="5040" w:hanging="360"/>
+      </w:pPr>
+    </w:lvl>
+    <w:lvl w:ilvl="7" w:tentative="1">
+      <w:start w:val="1"/>
+      <w:numFmt w:val="decimal"/>
+      <w:lvlText w:val="%8."/>
+      <w:lvlJc w:val="left"/>
+      <w:pPr>
+        <w:tabs>
+          <w:tab w:val="num" w:pos="5760"/>
+        </w:tabs>
+        <w:ind w:left="5760" w:hanging="360"/>
+      </w:pPr>
+    </w:lvl>
+    <w:lvl w:ilvl="8" w:tentative="1">
+      <w:start w:val="1"/>
+      <w:numFmt w:val="decimal"/>
+      <w:lvlText w:val="%9."/>
+      <w:lvlJc w:val="left"/>
+      <w:pPr>
+        <w:tabs>
+          <w:tab w:val="num" w:pos="6480"/>
+        </w:tabs>
+        <w:ind w:left="6480" w:hanging="360"/>
+      </w:pPr>
+    </w:lvl>
+  </w:abstractNum>
+  <w:abstractNum w:abstractNumId="14" w15:restartNumberingAfterBreak="0">
     <w:nsid w:val="36C1566F"/>
     <w:multiLevelType w:val="multilevel"/>
     <w:tmpl w:val="346C829A"/>
@@ -12743,7 +13415,7 @@
       </w:rPr>
     </w:lvl>
   </w:abstractNum>
-  <w:abstractNum w:abstractNumId="13" w15:restartNumberingAfterBreak="0">
+  <w:abstractNum w:abstractNumId="15" w15:restartNumberingAfterBreak="0">
     <w:nsid w:val="38A00761"/>
     <w:multiLevelType w:val="multilevel"/>
     <w:tmpl w:val="9766A590"/>
@@ -12892,7 +13564,7 @@
       </w:rPr>
     </w:lvl>
   </w:abstractNum>
-  <w:abstractNum w:abstractNumId="14" w15:restartNumberingAfterBreak="0">
+  <w:abstractNum w:abstractNumId="16" w15:restartNumberingAfterBreak="0">
     <w:nsid w:val="3B172976"/>
     <w:multiLevelType w:val="multilevel"/>
     <w:tmpl w:val="8372567E"/>
@@ -13005,7 +13677,7 @@
       </w:pPr>
     </w:lvl>
   </w:abstractNum>
-  <w:abstractNum w:abstractNumId="15" w15:restartNumberingAfterBreak="0">
+  <w:abstractNum w:abstractNumId="17" w15:restartNumberingAfterBreak="0">
     <w:nsid w:val="3DDC6B8B"/>
     <w:multiLevelType w:val="multilevel"/>
     <w:tmpl w:val="ECF4F75E"/>
@@ -13118,7 +13790,7 @@
       </w:pPr>
     </w:lvl>
   </w:abstractNum>
-  <w:abstractNum w:abstractNumId="16" w15:restartNumberingAfterBreak="0">
+  <w:abstractNum w:abstractNumId="18" w15:restartNumberingAfterBreak="0">
     <w:nsid w:val="3E6858E7"/>
     <w:multiLevelType w:val="multilevel"/>
     <w:tmpl w:val="CDF4B6C8"/>
@@ -13267,7 +13939,7 @@
       </w:rPr>
     </w:lvl>
   </w:abstractNum>
-  <w:abstractNum w:abstractNumId="17" w15:restartNumberingAfterBreak="0">
+  <w:abstractNum w:abstractNumId="19" w15:restartNumberingAfterBreak="0">
     <w:nsid w:val="405B3216"/>
     <w:multiLevelType w:val="multilevel"/>
     <w:tmpl w:val="566A9732"/>
@@ -13416,7 +14088,7 @@
       </w:rPr>
     </w:lvl>
   </w:abstractNum>
-  <w:abstractNum w:abstractNumId="18" w15:restartNumberingAfterBreak="0">
+  <w:abstractNum w:abstractNumId="20" w15:restartNumberingAfterBreak="0">
     <w:nsid w:val="407500D7"/>
     <w:multiLevelType w:val="multilevel"/>
     <w:tmpl w:val="EAC429E8"/>
@@ -13529,7 +14201,7 @@
       </w:pPr>
     </w:lvl>
   </w:abstractNum>
-  <w:abstractNum w:abstractNumId="19" w15:restartNumberingAfterBreak="0">
+  <w:abstractNum w:abstractNumId="21" w15:restartNumberingAfterBreak="0">
     <w:nsid w:val="41575F9F"/>
     <w:multiLevelType w:val="multilevel"/>
     <w:tmpl w:val="6978AC60"/>
@@ -13642,7 +14314,7 @@
       </w:pPr>
     </w:lvl>
   </w:abstractNum>
-  <w:abstractNum w:abstractNumId="20" w15:restartNumberingAfterBreak="0">
+  <w:abstractNum w:abstractNumId="22" w15:restartNumberingAfterBreak="0">
     <w:nsid w:val="41EB236D"/>
     <w:multiLevelType w:val="multilevel"/>
     <w:tmpl w:val="66AC5A16"/>
@@ -13755,7 +14427,7 @@
       </w:pPr>
     </w:lvl>
   </w:abstractNum>
-  <w:abstractNum w:abstractNumId="21" w15:restartNumberingAfterBreak="0">
+  <w:abstractNum w:abstractNumId="23" w15:restartNumberingAfterBreak="0">
     <w:nsid w:val="423654B3"/>
     <w:multiLevelType w:val="multilevel"/>
     <w:tmpl w:val="329A9F3C"/>
@@ -13868,7 +14540,120 @@
       </w:pPr>
     </w:lvl>
   </w:abstractNum>
-  <w:abstractNum w:abstractNumId="22" w15:restartNumberingAfterBreak="0">
+  <w:abstractNum w:abstractNumId="24" w15:restartNumberingAfterBreak="0">
+    <w:nsid w:val="43112BA0"/>
+    <w:multiLevelType w:val="multilevel"/>
+    <w:tmpl w:val="8372567E"/>
+    <w:lvl w:ilvl="0">
+      <w:start w:val="1"/>
+      <w:numFmt w:val="decimal"/>
+      <w:lvlText w:val="%1."/>
+      <w:lvlJc w:val="left"/>
+      <w:pPr>
+        <w:tabs>
+          <w:tab w:val="num" w:pos="720"/>
+        </w:tabs>
+        <w:ind w:left="720" w:hanging="360"/>
+      </w:pPr>
+    </w:lvl>
+    <w:lvl w:ilvl="1" w:tentative="1">
+      <w:start w:val="1"/>
+      <w:numFmt w:val="decimal"/>
+      <w:lvlText w:val="%2."/>
+      <w:lvlJc w:val="left"/>
+      <w:pPr>
+        <w:tabs>
+          <w:tab w:val="num" w:pos="1440"/>
+        </w:tabs>
+        <w:ind w:left="1440" w:hanging="360"/>
+      </w:pPr>
+    </w:lvl>
+    <w:lvl w:ilvl="2" w:tentative="1">
+      <w:start w:val="1"/>
+      <w:numFmt w:val="decimal"/>
+      <w:lvlText w:val="%3."/>
+      <w:lvlJc w:val="left"/>
+      <w:pPr>
+        <w:tabs>
+          <w:tab w:val="num" w:pos="2160"/>
+        </w:tabs>
+        <w:ind w:left="2160" w:hanging="360"/>
+      </w:pPr>
+    </w:lvl>
+    <w:lvl w:ilvl="3" w:tentative="1">
+      <w:start w:val="1"/>
+      <w:numFmt w:val="decimal"/>
+      <w:lvlText w:val="%4."/>
+      <w:lvlJc w:val="left"/>
+      <w:pPr>
+        <w:tabs>
+          <w:tab w:val="num" w:pos="2880"/>
+        </w:tabs>
+        <w:ind w:left="2880" w:hanging="360"/>
+      </w:pPr>
+    </w:lvl>
+    <w:lvl w:ilvl="4" w:tentative="1">
+      <w:start w:val="1"/>
+      <w:numFmt w:val="decimal"/>
+      <w:lvlText w:val="%5."/>
+      <w:lvlJc w:val="left"/>
+      <w:pPr>
+        <w:tabs>
+          <w:tab w:val="num" w:pos="3600"/>
+        </w:tabs>
+        <w:ind w:left="3600" w:hanging="360"/>
+      </w:pPr>
+    </w:lvl>
+    <w:lvl w:ilvl="5" w:tentative="1">
+      <w:start w:val="1"/>
+      <w:numFmt w:val="decimal"/>
+      <w:lvlText w:val="%6."/>
+      <w:lvlJc w:val="left"/>
+      <w:pPr>
+        <w:tabs>
+          <w:tab w:val="num" w:pos="4320"/>
+        </w:tabs>
+        <w:ind w:left="4320" w:hanging="360"/>
+      </w:pPr>
+    </w:lvl>
+    <w:lvl w:ilvl="6" w:tentative="1">
+      <w:start w:val="1"/>
+      <w:numFmt w:val="decimal"/>
+      <w:lvlText w:val="%7."/>
+      <w:lvlJc w:val="left"/>
+      <w:pPr>
+        <w:tabs>
+          <w:tab w:val="num" w:pos="5040"/>
+        </w:tabs>
+        <w:ind w:left="5040" w:hanging="360"/>
+      </w:pPr>
+    </w:lvl>
+    <w:lvl w:ilvl="7" w:tentative="1">
+      <w:start w:val="1"/>
+      <w:numFmt w:val="decimal"/>
+      <w:lvlText w:val="%8."/>
+      <w:lvlJc w:val="left"/>
+      <w:pPr>
+        <w:tabs>
+          <w:tab w:val="num" w:pos="5760"/>
+        </w:tabs>
+        <w:ind w:left="5760" w:hanging="360"/>
+      </w:pPr>
+    </w:lvl>
+    <w:lvl w:ilvl="8" w:tentative="1">
+      <w:start w:val="1"/>
+      <w:numFmt w:val="decimal"/>
+      <w:lvlText w:val="%9."/>
+      <w:lvlJc w:val="left"/>
+      <w:pPr>
+        <w:tabs>
+          <w:tab w:val="num" w:pos="6480"/>
+        </w:tabs>
+        <w:ind w:left="6480" w:hanging="360"/>
+      </w:pPr>
+    </w:lvl>
+  </w:abstractNum>
+  <w:abstractNum w:abstractNumId="25" w15:restartNumberingAfterBreak="0">
     <w:nsid w:val="4D9630E7"/>
     <w:multiLevelType w:val="multilevel"/>
     <w:tmpl w:val="A3625A24"/>
@@ -13981,7 +14766,7 @@
       </w:pPr>
     </w:lvl>
   </w:abstractNum>
-  <w:abstractNum w:abstractNumId="23" w15:restartNumberingAfterBreak="0">
+  <w:abstractNum w:abstractNumId="26" w15:restartNumberingAfterBreak="0">
     <w:nsid w:val="4EED15AA"/>
     <w:multiLevelType w:val="multilevel"/>
     <w:tmpl w:val="C2AE3408"/>
@@ -14130,7 +14915,7 @@
       </w:rPr>
     </w:lvl>
   </w:abstractNum>
-  <w:abstractNum w:abstractNumId="24" w15:restartNumberingAfterBreak="0">
+  <w:abstractNum w:abstractNumId="27" w15:restartNumberingAfterBreak="0">
     <w:nsid w:val="525A040F"/>
     <w:multiLevelType w:val="multilevel"/>
     <w:tmpl w:val="DF4AA4A8"/>
@@ -14243,7 +15028,7 @@
       </w:pPr>
     </w:lvl>
   </w:abstractNum>
-  <w:abstractNum w:abstractNumId="25" w15:restartNumberingAfterBreak="0">
+  <w:abstractNum w:abstractNumId="28" w15:restartNumberingAfterBreak="0">
     <w:nsid w:val="5AAA7665"/>
     <w:multiLevelType w:val="multilevel"/>
     <w:tmpl w:val="BBDEA7E0"/>
@@ -14356,7 +15141,7 @@
       </w:pPr>
     </w:lvl>
   </w:abstractNum>
-  <w:abstractNum w:abstractNumId="26" w15:restartNumberingAfterBreak="0">
+  <w:abstractNum w:abstractNumId="29" w15:restartNumberingAfterBreak="0">
     <w:nsid w:val="5D5725E7"/>
     <w:multiLevelType w:val="multilevel"/>
     <w:tmpl w:val="8FD43D70"/>
@@ -14469,7 +15254,7 @@
       </w:pPr>
     </w:lvl>
   </w:abstractNum>
-  <w:abstractNum w:abstractNumId="27" w15:restartNumberingAfterBreak="0">
+  <w:abstractNum w:abstractNumId="30" w15:restartNumberingAfterBreak="0">
     <w:nsid w:val="5DBB1689"/>
     <w:multiLevelType w:val="multilevel"/>
     <w:tmpl w:val="96E07C9E"/>
@@ -14618,7 +15403,7 @@
       </w:rPr>
     </w:lvl>
   </w:abstractNum>
-  <w:abstractNum w:abstractNumId="28" w15:restartNumberingAfterBreak="0">
+  <w:abstractNum w:abstractNumId="31" w15:restartNumberingAfterBreak="0">
     <w:nsid w:val="659E31E2"/>
     <w:multiLevelType w:val="multilevel"/>
     <w:tmpl w:val="CAAA988A"/>
@@ -14731,7 +15516,7 @@
       </w:pPr>
     </w:lvl>
   </w:abstractNum>
-  <w:abstractNum w:abstractNumId="29" w15:restartNumberingAfterBreak="0">
+  <w:abstractNum w:abstractNumId="32" w15:restartNumberingAfterBreak="0">
     <w:nsid w:val="66E524A8"/>
     <w:multiLevelType w:val="multilevel"/>
     <w:tmpl w:val="E80831CC"/>
@@ -14880,7 +15665,7 @@
       </w:rPr>
     </w:lvl>
   </w:abstractNum>
-  <w:abstractNum w:abstractNumId="30" w15:restartNumberingAfterBreak="0">
+  <w:abstractNum w:abstractNumId="33" w15:restartNumberingAfterBreak="0">
     <w:nsid w:val="689901A4"/>
     <w:multiLevelType w:val="multilevel"/>
     <w:tmpl w:val="4412CDEC"/>
@@ -14993,7 +15778,120 @@
       </w:pPr>
     </w:lvl>
   </w:abstractNum>
-  <w:abstractNum w:abstractNumId="31" w15:restartNumberingAfterBreak="0">
+  <w:abstractNum w:abstractNumId="34" w15:restartNumberingAfterBreak="0">
+    <w:nsid w:val="69744A9A"/>
+    <w:multiLevelType w:val="multilevel"/>
+    <w:tmpl w:val="8372567E"/>
+    <w:lvl w:ilvl="0">
+      <w:start w:val="1"/>
+      <w:numFmt w:val="decimal"/>
+      <w:lvlText w:val="%1."/>
+      <w:lvlJc w:val="left"/>
+      <w:pPr>
+        <w:tabs>
+          <w:tab w:val="num" w:pos="720"/>
+        </w:tabs>
+        <w:ind w:left="720" w:hanging="360"/>
+      </w:pPr>
+    </w:lvl>
+    <w:lvl w:ilvl="1" w:tentative="1">
+      <w:start w:val="1"/>
+      <w:numFmt w:val="decimal"/>
+      <w:lvlText w:val="%2."/>
+      <w:lvlJc w:val="left"/>
+      <w:pPr>
+        <w:tabs>
+          <w:tab w:val="num" w:pos="1440"/>
+        </w:tabs>
+        <w:ind w:left="1440" w:hanging="360"/>
+      </w:pPr>
+    </w:lvl>
+    <w:lvl w:ilvl="2" w:tentative="1">
+      <w:start w:val="1"/>
+      <w:numFmt w:val="decimal"/>
+      <w:lvlText w:val="%3."/>
+      <w:lvlJc w:val="left"/>
+      <w:pPr>
+        <w:tabs>
+          <w:tab w:val="num" w:pos="2160"/>
+        </w:tabs>
+        <w:ind w:left="2160" w:hanging="360"/>
+      </w:pPr>
+    </w:lvl>
+    <w:lvl w:ilvl="3" w:tentative="1">
+      <w:start w:val="1"/>
+      <w:numFmt w:val="decimal"/>
+      <w:lvlText w:val="%4."/>
+      <w:lvlJc w:val="left"/>
+      <w:pPr>
+        <w:tabs>
+          <w:tab w:val="num" w:pos="2880"/>
+        </w:tabs>
+        <w:ind w:left="2880" w:hanging="360"/>
+      </w:pPr>
+    </w:lvl>
+    <w:lvl w:ilvl="4" w:tentative="1">
+      <w:start w:val="1"/>
+      <w:numFmt w:val="decimal"/>
+      <w:lvlText w:val="%5."/>
+      <w:lvlJc w:val="left"/>
+      <w:pPr>
+        <w:tabs>
+          <w:tab w:val="num" w:pos="3600"/>
+        </w:tabs>
+        <w:ind w:left="3600" w:hanging="360"/>
+      </w:pPr>
+    </w:lvl>
+    <w:lvl w:ilvl="5" w:tentative="1">
+      <w:start w:val="1"/>
+      <w:numFmt w:val="decimal"/>
+      <w:lvlText w:val="%6."/>
+      <w:lvlJc w:val="left"/>
+      <w:pPr>
+        <w:tabs>
+          <w:tab w:val="num" w:pos="4320"/>
+        </w:tabs>
+        <w:ind w:left="4320" w:hanging="360"/>
+      </w:pPr>
+    </w:lvl>
+    <w:lvl w:ilvl="6" w:tentative="1">
+      <w:start w:val="1"/>
+      <w:numFmt w:val="decimal"/>
+      <w:lvlText w:val="%7."/>
+      <w:lvlJc w:val="left"/>
+      <w:pPr>
+        <w:tabs>
+          <w:tab w:val="num" w:pos="5040"/>
+        </w:tabs>
+        <w:ind w:left="5040" w:hanging="360"/>
+      </w:pPr>
+    </w:lvl>
+    <w:lvl w:ilvl="7" w:tentative="1">
+      <w:start w:val="1"/>
+      <w:numFmt w:val="decimal"/>
+      <w:lvlText w:val="%8."/>
+      <w:lvlJc w:val="left"/>
+      <w:pPr>
+        <w:tabs>
+          <w:tab w:val="num" w:pos="5760"/>
+        </w:tabs>
+        <w:ind w:left="5760" w:hanging="360"/>
+      </w:pPr>
+    </w:lvl>
+    <w:lvl w:ilvl="8" w:tentative="1">
+      <w:start w:val="1"/>
+      <w:numFmt w:val="decimal"/>
+      <w:lvlText w:val="%9."/>
+      <w:lvlJc w:val="left"/>
+      <w:pPr>
+        <w:tabs>
+          <w:tab w:val="num" w:pos="6480"/>
+        </w:tabs>
+        <w:ind w:left="6480" w:hanging="360"/>
+      </w:pPr>
+    </w:lvl>
+  </w:abstractNum>
+  <w:abstractNum w:abstractNumId="35" w15:restartNumberingAfterBreak="0">
     <w:nsid w:val="69D970C2"/>
     <w:multiLevelType w:val="multilevel"/>
     <w:tmpl w:val="1B968DEE"/>
@@ -15142,7 +16040,7 @@
       </w:rPr>
     </w:lvl>
   </w:abstractNum>
-  <w:abstractNum w:abstractNumId="32" w15:restartNumberingAfterBreak="0">
+  <w:abstractNum w:abstractNumId="36" w15:restartNumberingAfterBreak="0">
     <w:nsid w:val="6A31357A"/>
     <w:multiLevelType w:val="multilevel"/>
     <w:tmpl w:val="9616607A"/>
@@ -15255,7 +16153,7 @@
       </w:pPr>
     </w:lvl>
   </w:abstractNum>
-  <w:abstractNum w:abstractNumId="33" w15:restartNumberingAfterBreak="0">
+  <w:abstractNum w:abstractNumId="37" w15:restartNumberingAfterBreak="0">
     <w:nsid w:val="6CCE5E06"/>
     <w:multiLevelType w:val="multilevel"/>
     <w:tmpl w:val="B3FC4210"/>
@@ -15368,7 +16266,7 @@
       </w:pPr>
     </w:lvl>
   </w:abstractNum>
-  <w:abstractNum w:abstractNumId="34" w15:restartNumberingAfterBreak="0">
+  <w:abstractNum w:abstractNumId="38" w15:restartNumberingAfterBreak="0">
     <w:nsid w:val="72335839"/>
     <w:multiLevelType w:val="multilevel"/>
     <w:tmpl w:val="9A7ABC88"/>
@@ -15481,7 +16379,7 @@
       </w:pPr>
     </w:lvl>
   </w:abstractNum>
-  <w:abstractNum w:abstractNumId="35" w15:restartNumberingAfterBreak="0">
+  <w:abstractNum w:abstractNumId="39" w15:restartNumberingAfterBreak="0">
     <w:nsid w:val="7237763A"/>
     <w:multiLevelType w:val="multilevel"/>
     <w:tmpl w:val="BD920148"/>
@@ -15594,7 +16492,7 @@
       </w:pPr>
     </w:lvl>
   </w:abstractNum>
-  <w:abstractNum w:abstractNumId="36" w15:restartNumberingAfterBreak="0">
+  <w:abstractNum w:abstractNumId="40" w15:restartNumberingAfterBreak="0">
     <w:nsid w:val="74D134FB"/>
     <w:multiLevelType w:val="multilevel"/>
     <w:tmpl w:val="A0D242C0"/>
@@ -15707,7 +16605,7 @@
       </w:pPr>
     </w:lvl>
   </w:abstractNum>
-  <w:abstractNum w:abstractNumId="37" w15:restartNumberingAfterBreak="0">
+  <w:abstractNum w:abstractNumId="41" w15:restartNumberingAfterBreak="0">
     <w:nsid w:val="75045E27"/>
     <w:multiLevelType w:val="multilevel"/>
     <w:tmpl w:val="97BEE092"/>
@@ -15856,7 +16754,7 @@
       </w:rPr>
     </w:lvl>
   </w:abstractNum>
-  <w:abstractNum w:abstractNumId="38" w15:restartNumberingAfterBreak="0">
+  <w:abstractNum w:abstractNumId="42" w15:restartNumberingAfterBreak="0">
     <w:nsid w:val="75674ACC"/>
     <w:multiLevelType w:val="multilevel"/>
     <w:tmpl w:val="4D4A906E"/>
@@ -15969,7 +16867,7 @@
       </w:pPr>
     </w:lvl>
   </w:abstractNum>
-  <w:abstractNum w:abstractNumId="39" w15:restartNumberingAfterBreak="0">
+  <w:abstractNum w:abstractNumId="43" w15:restartNumberingAfterBreak="0">
     <w:nsid w:val="77651F6D"/>
     <w:multiLevelType w:val="multilevel"/>
     <w:tmpl w:val="BEA8B528"/>
@@ -16082,7 +16980,7 @@
       </w:pPr>
     </w:lvl>
   </w:abstractNum>
-  <w:abstractNum w:abstractNumId="40" w15:restartNumberingAfterBreak="0">
+  <w:abstractNum w:abstractNumId="44" w15:restartNumberingAfterBreak="0">
     <w:nsid w:val="7A4501A9"/>
     <w:multiLevelType w:val="multilevel"/>
     <w:tmpl w:val="BF26BFF8"/>
@@ -16195,7 +17093,7 @@
       </w:pPr>
     </w:lvl>
   </w:abstractNum>
-  <w:abstractNum w:abstractNumId="41" w15:restartNumberingAfterBreak="0">
+  <w:abstractNum w:abstractNumId="45" w15:restartNumberingAfterBreak="0">
     <w:nsid w:val="7CF35B6F"/>
     <w:multiLevelType w:val="multilevel"/>
     <w:tmpl w:val="F432BDD8"/>
@@ -16312,43 +17210,43 @@
     <w:abstractNumId w:val="0"/>
   </w:num>
   <w:num w:numId="2" w16cid:durableId="2035962587">
-    <w:abstractNumId w:val="12"/>
+    <w:abstractNumId w:val="14"/>
   </w:num>
   <w:num w:numId="3" w16cid:durableId="949630115">
-    <w:abstractNumId w:val="31"/>
+    <w:abstractNumId w:val="35"/>
   </w:num>
   <w:num w:numId="4" w16cid:durableId="758522267">
+    <w:abstractNumId w:val="23"/>
+  </w:num>
+  <w:num w:numId="5" w16cid:durableId="755131131">
+    <w:abstractNumId w:val="30"/>
+  </w:num>
+  <w:num w:numId="6" w16cid:durableId="1116944712">
+    <w:abstractNumId w:val="25"/>
+  </w:num>
+  <w:num w:numId="7" w16cid:durableId="1013846406">
+    <w:abstractNumId w:val="22"/>
+  </w:num>
+  <w:num w:numId="8" w16cid:durableId="1198471537">
+    <w:abstractNumId w:val="33"/>
+  </w:num>
+  <w:num w:numId="9" w16cid:durableId="496963465">
+    <w:abstractNumId w:val="27"/>
+  </w:num>
+  <w:num w:numId="10" w16cid:durableId="1793087086">
+    <w:abstractNumId w:val="37"/>
+  </w:num>
+  <w:num w:numId="11" w16cid:durableId="639381789">
+    <w:abstractNumId w:val="40"/>
+  </w:num>
+  <w:num w:numId="12" w16cid:durableId="879710481">
+    <w:abstractNumId w:val="29"/>
+  </w:num>
+  <w:num w:numId="13" w16cid:durableId="615912581">
     <w:abstractNumId w:val="21"/>
   </w:num>
-  <w:num w:numId="5" w16cid:durableId="755131131">
-    <w:abstractNumId w:val="27"/>
-  </w:num>
-  <w:num w:numId="6" w16cid:durableId="1116944712">
-    <w:abstractNumId w:val="22"/>
-  </w:num>
-  <w:num w:numId="7" w16cid:durableId="1013846406">
-    <w:abstractNumId w:val="20"/>
-  </w:num>
-  <w:num w:numId="8" w16cid:durableId="1198471537">
-    <w:abstractNumId w:val="30"/>
-  </w:num>
-  <w:num w:numId="9" w16cid:durableId="496963465">
-    <w:abstractNumId w:val="24"/>
-  </w:num>
-  <w:num w:numId="10" w16cid:durableId="1793087086">
-    <w:abstractNumId w:val="33"/>
-  </w:num>
-  <w:num w:numId="11" w16cid:durableId="639381789">
-    <w:abstractNumId w:val="36"/>
-  </w:num>
-  <w:num w:numId="12" w16cid:durableId="879710481">
-    <w:abstractNumId w:val="26"/>
-  </w:num>
-  <w:num w:numId="13" w16cid:durableId="615912581">
-    <w:abstractNumId w:val="19"/>
-  </w:num>
   <w:num w:numId="14" w16cid:durableId="442657033">
-    <w:abstractNumId w:val="39"/>
+    <w:abstractNumId w:val="43"/>
   </w:num>
   <w:num w:numId="15" w16cid:durableId="462309774">
     <w:abstractNumId w:val="4"/>
@@ -16357,82 +17255,94 @@
     <w:abstractNumId w:val="1"/>
   </w:num>
   <w:num w:numId="17" w16cid:durableId="961769830">
-    <w:abstractNumId w:val="35"/>
+    <w:abstractNumId w:val="39"/>
   </w:num>
   <w:num w:numId="18" w16cid:durableId="911426862">
     <w:abstractNumId w:val="8"/>
   </w:num>
   <w:num w:numId="19" w16cid:durableId="301732558">
-    <w:abstractNumId w:val="18"/>
+    <w:abstractNumId w:val="20"/>
   </w:num>
   <w:num w:numId="20" w16cid:durableId="1631129902">
     <w:abstractNumId w:val="9"/>
   </w:num>
   <w:num w:numId="21" w16cid:durableId="1261258701">
-    <w:abstractNumId w:val="15"/>
+    <w:abstractNumId w:val="17"/>
   </w:num>
   <w:num w:numId="22" w16cid:durableId="1082139385">
-    <w:abstractNumId w:val="28"/>
+    <w:abstractNumId w:val="31"/>
   </w:num>
   <w:num w:numId="23" w16cid:durableId="1413700826">
-    <w:abstractNumId w:val="32"/>
+    <w:abstractNumId w:val="36"/>
   </w:num>
   <w:num w:numId="24" w16cid:durableId="1748066663">
     <w:abstractNumId w:val="5"/>
   </w:num>
   <w:num w:numId="25" w16cid:durableId="85614526">
-    <w:abstractNumId w:val="40"/>
+    <w:abstractNumId w:val="44"/>
   </w:num>
   <w:num w:numId="26" w16cid:durableId="1576164505">
-    <w:abstractNumId w:val="16"/>
+    <w:abstractNumId w:val="18"/>
   </w:num>
   <w:num w:numId="27" w16cid:durableId="1174151349">
     <w:abstractNumId w:val="3"/>
   </w:num>
   <w:num w:numId="28" w16cid:durableId="2002850244">
-    <w:abstractNumId w:val="29"/>
+    <w:abstractNumId w:val="32"/>
   </w:num>
   <w:num w:numId="29" w16cid:durableId="1864899903">
     <w:abstractNumId w:val="10"/>
   </w:num>
   <w:num w:numId="30" w16cid:durableId="391588196">
-    <w:abstractNumId w:val="13"/>
+    <w:abstractNumId w:val="15"/>
   </w:num>
   <w:num w:numId="31" w16cid:durableId="1820729954">
     <w:abstractNumId w:val="7"/>
   </w:num>
   <w:num w:numId="32" w16cid:durableId="976565481">
-    <w:abstractNumId w:val="11"/>
+    <w:abstractNumId w:val="12"/>
   </w:num>
   <w:num w:numId="33" w16cid:durableId="509830765">
     <w:abstractNumId w:val="2"/>
   </w:num>
   <w:num w:numId="34" w16cid:durableId="63571194">
-    <w:abstractNumId w:val="17"/>
+    <w:abstractNumId w:val="19"/>
   </w:num>
   <w:num w:numId="35" w16cid:durableId="118914675">
     <w:abstractNumId w:val="6"/>
   </w:num>
   <w:num w:numId="36" w16cid:durableId="781346167">
-    <w:abstractNumId w:val="23"/>
+    <w:abstractNumId w:val="26"/>
   </w:num>
   <w:num w:numId="37" w16cid:durableId="1667903987">
-    <w:abstractNumId w:val="25"/>
+    <w:abstractNumId w:val="28"/>
   </w:num>
   <w:num w:numId="38" w16cid:durableId="2084983314">
-    <w:abstractNumId w:val="37"/>
+    <w:abstractNumId w:val="41"/>
   </w:num>
   <w:num w:numId="39" w16cid:durableId="1082264245">
-    <w:abstractNumId w:val="14"/>
+    <w:abstractNumId w:val="16"/>
   </w:num>
   <w:num w:numId="40" w16cid:durableId="357970460">
+    <w:abstractNumId w:val="38"/>
+  </w:num>
+  <w:num w:numId="41" w16cid:durableId="663557899">
+    <w:abstractNumId w:val="42"/>
+  </w:num>
+  <w:num w:numId="42" w16cid:durableId="1193811790">
+    <w:abstractNumId w:val="45"/>
+  </w:num>
+  <w:num w:numId="43" w16cid:durableId="1205408923">
+    <w:abstractNumId w:val="11"/>
+  </w:num>
+  <w:num w:numId="44" w16cid:durableId="211111983">
     <w:abstractNumId w:val="34"/>
   </w:num>
-  <w:num w:numId="41" w16cid:durableId="663557899">
-    <w:abstractNumId w:val="38"/>
+  <w:num w:numId="45" w16cid:durableId="706678755">
+    <w:abstractNumId w:val="13"/>
   </w:num>
-  <w:num w:numId="42" w16cid:durableId="1193811790">
-    <w:abstractNumId w:val="41"/>
+  <w:num w:numId="46" w16cid:durableId="1252932943">
+    <w:abstractNumId w:val="24"/>
   </w:num>
 </w:numbering>
 </file>
@@ -16927,7 +17837,6 @@
     <w:name w:val="Hyperlink"/>
     <w:basedOn w:val="DefaultParagraphFont"/>
     <w:uiPriority w:val="99"/>
-    <w:semiHidden/>
     <w:unhideWhenUsed/>
     <w:rPr>
       <w:color w:val="0000FF"/>
@@ -17115,6 +18024,29 @@
       <w:sz w:val="20"/>
       <w:szCs w:val="20"/>
     </w:rPr>
+  </w:style>
+  <w:style w:type="character" w:styleId="UnresolvedMention">
+    <w:name w:val="Unresolved Mention"/>
+    <w:basedOn w:val="DefaultParagraphFont"/>
+    <w:uiPriority w:val="99"/>
+    <w:semiHidden/>
+    <w:unhideWhenUsed/>
+    <w:rsid w:val="00C21041"/>
+    <w:rPr>
+      <w:color w:val="605E5C"/>
+      <w:shd w:val="clear" w:color="auto" w:fill="E1DFDD"/>
+    </w:rPr>
+  </w:style>
+  <w:style w:type="paragraph" w:styleId="ListParagraph">
+    <w:name w:val="List Paragraph"/>
+    <w:basedOn w:val="Normal"/>
+    <w:uiPriority w:val="34"/>
+    <w:qFormat/>
+    <w:rsid w:val="00EE2A06"/>
+    <w:pPr>
+      <w:ind w:left="720"/>
+      <w:contextualSpacing/>
+    </w:pPr>
   </w:style>
 </w:styles>
 </file>

</xml_diff>

<commit_message>
Pantalla de inicio de sesion: enlace Forgot your password? con los pasos de recuperacion; instalador 1.0.2 y manuales actualizados
Co-Authored-By: Claude Sonnet 5.5 <noreply@anthropic.com>
</commit_message>
<xml_diff>
--- a/8 - Codigo Fuente/Edelstahl-ERP/Documentacion/Manuales/Manual-de-instalacion.docx
+++ b/8 - Codigo Fuente/Edelstahl-ERP/Documentacion/Manuales/Manual-de-instalacion.docx
@@ -5861,6 +5861,7 @@
           <w:sz w:val="22"/>
           <w:szCs w:val="22"/>
         </w:rPr>
+        <w:lastRenderedPageBreak/>
         <w:t xml:space="preserve">Verificá en </w:t>
       </w:r>
       <w:r>
@@ -6747,6 +6748,7 @@
                 <w:sz w:val="20"/>
                 <w:szCs w:val="20"/>
               </w:rPr>
+              <w:lastRenderedPageBreak/>
               <w:t>BaseNegocio</w:t>
             </w:r>
           </w:p>
@@ -7661,6 +7663,7 @@
           <w:sz w:val="22"/>
           <w:szCs w:val="22"/>
         </w:rPr>
+        <w:lastRenderedPageBreak/>
         <w:t>Doble clic en el acceso directo.</w:t>
       </w:r>
     </w:p>
@@ -7929,6 +7932,7 @@
           <w:sz w:val="22"/>
           <w:szCs w:val="22"/>
         </w:rPr>
+        <w:lastRenderedPageBreak/>
         <w:drawing>
           <wp:inline distT="0" distB="0" distL="0" distR="0" wp14:anchorId="1E0B4401" wp14:editId="098E1BDE">
             <wp:extent cx="3175000" cy="3022940"/>
@@ -8131,10 +8135,10 @@
           <w:szCs w:val="22"/>
         </w:rPr>
         <w:drawing>
-          <wp:inline distT="0" distB="0" distL="0" distR="0" wp14:anchorId="20DD16F2" wp14:editId="45953E1F">
+          <wp:inline distT="0" distB="0" distL="0" distR="0" wp14:anchorId="23CCBA29" wp14:editId="68BBEED9">
             <wp:extent cx="5080000" cy="3361976"/>
             <wp:effectExtent l="0" t="0" r="6350" b="0"/>
-            <wp:docPr id="1700946369" name="Picture 2"/>
+            <wp:docPr id="2052785379" name="Picture 1"/>
             <wp:cNvGraphicFramePr>
               <a:graphicFrameLocks xmlns:a="http://schemas.openxmlformats.org/drawingml/2006/main" noChangeAspect="1"/>
             </wp:cNvGraphicFramePr>
@@ -8142,7 +8146,7 @@
               <a:graphicData uri="http://schemas.openxmlformats.org/drawingml/2006/picture">
                 <pic:pic xmlns:pic="http://schemas.openxmlformats.org/drawingml/2006/picture">
                   <pic:nvPicPr>
-                    <pic:cNvPr id="1700946369" name=""/>
+                    <pic:cNvPr id="2052785379" name=""/>
                     <pic:cNvPicPr/>
                   </pic:nvPicPr>
                   <pic:blipFill>
@@ -8267,6 +8271,7 @@
         <w:rPr>
           <w:rFonts w:ascii="Calibri" w:eastAsia="Times New Roman" w:hAnsi="Calibri" w:cs="Calibri"/>
         </w:rPr>
+        <w:lastRenderedPageBreak/>
         <w:t>9. Verificación de la instalación</w:t>
       </w:r>
     </w:p>
@@ -8551,7 +8556,7 @@
           <w:szCs w:val="22"/>
         </w:rPr>
         <w:drawing>
-          <wp:inline distT="0" distB="0" distL="0" distR="0" wp14:anchorId="6142BFF3" wp14:editId="5ED61ADE">
+          <wp:inline distT="0" distB="0" distL="0" distR="0" wp14:anchorId="6142BFF3" wp14:editId="50AFADCC">
             <wp:extent cx="5397500" cy="3078936"/>
             <wp:effectExtent l="0" t="0" r="0" b="7620"/>
             <wp:docPr id="1046379083" name="Picture 1"/>
@@ -8752,6 +8757,7 @@
         <w:rPr>
           <w:rFonts w:ascii="Calibri" w:eastAsia="Times New Roman" w:hAnsi="Calibri" w:cs="Calibri"/>
         </w:rPr>
+        <w:lastRenderedPageBreak/>
         <w:t>9.3. Verificación de los archivos</w:t>
       </w:r>
     </w:p>
@@ -9503,6 +9509,7 @@
         <w:rPr>
           <w:rFonts w:ascii="Calibri" w:eastAsia="Times New Roman" w:hAnsi="Calibri" w:cs="Calibri"/>
         </w:rPr>
+        <w:lastRenderedPageBreak/>
         <w:t>10.4. El programa no se abre, o se cierra apenas se ejecuta</w:t>
       </w:r>
     </w:p>
@@ -10132,6 +10139,7 @@
         <w:rPr>
           <w:rFonts w:ascii="Calibri" w:eastAsia="Times New Roman" w:hAnsi="Calibri" w:cs="Calibri"/>
         </w:rPr>
+        <w:lastRenderedPageBreak/>
         <w:t>10.8. No puedo abrir el archivo de respaldo (.bak)</w:t>
       </w:r>
     </w:p>
@@ -10362,7 +10370,7 @@
           <w:sz w:val="22"/>
           <w:szCs w:val="22"/>
         </w:rPr>
-        <w:t>Un administrador inicia sesión y abre Administración, pestaña Users.</w:t>
+        <w:t>En la pantalla de inicio de sesión, el usuario puede tocar “Forgot your password?”, que le indica estos pasos. Un administrador inicia sesión y abre Administración, pestaña Users.</w:t>
       </w:r>
     </w:p>
     <w:p>
@@ -10688,6 +10696,7 @@
         <w:rPr>
           <w:rFonts w:ascii="Calibri" w:eastAsia="Times New Roman" w:hAnsi="Calibri" w:cs="Calibri"/>
         </w:rPr>
+        <w:lastRenderedPageBreak/>
         <w:t>11.1. Desinstalar Edelstahl ERP</w:t>
       </w:r>
     </w:p>
@@ -11352,6 +11361,7 @@
         <w:rPr>
           <w:rFonts w:ascii="Calibri" w:eastAsia="Times New Roman" w:hAnsi="Calibri" w:cs="Calibri"/>
         </w:rPr>
+        <w:lastRenderedPageBreak/>
         <w:t>14. Resumen de pasos de instalación</w:t>
       </w:r>
     </w:p>

</xml_diff>

<commit_message>
Recover password: al tocar el enlace del inicio de sesion se muestra el WhatsApp de contacto (configurable en App.config); instalador 1.0.3 y manuales
Co-Authored-By: Claude Sonnet 5.5 <noreply@anthropic.com>
</commit_message>
<xml_diff>
--- a/8 - Codigo Fuente/Edelstahl-ERP/Documentacion/Manuales/Manual-de-instalacion.docx
+++ b/8 - Codigo Fuente/Edelstahl-ERP/Documentacion/Manuales/Manual-de-instalacion.docx
@@ -8135,10 +8135,10 @@
           <w:szCs w:val="22"/>
         </w:rPr>
         <w:drawing>
-          <wp:inline distT="0" distB="0" distL="0" distR="0" wp14:anchorId="23CCBA29" wp14:editId="68BBEED9">
+          <wp:inline distT="0" distB="0" distL="0" distR="0" wp14:anchorId="27CBD474" wp14:editId="301ADC63">
             <wp:extent cx="5080000" cy="3361976"/>
             <wp:effectExtent l="0" t="0" r="6350" b="0"/>
-            <wp:docPr id="2052785379" name="Picture 1"/>
+            <wp:docPr id="1366986597" name="Picture 1"/>
             <wp:cNvGraphicFramePr>
               <a:graphicFrameLocks xmlns:a="http://schemas.openxmlformats.org/drawingml/2006/main" noChangeAspect="1"/>
             </wp:cNvGraphicFramePr>
@@ -8146,7 +8146,7 @@
               <a:graphicData uri="http://schemas.openxmlformats.org/drawingml/2006/picture">
                 <pic:pic xmlns:pic="http://schemas.openxmlformats.org/drawingml/2006/picture">
                   <pic:nvPicPr>
-                    <pic:cNvPr id="2052785379" name=""/>
+                    <pic:cNvPr id="1366986597" name=""/>
                     <pic:cNvPicPr/>
                   </pic:nvPicPr>
                   <pic:blipFill>
@@ -8556,7 +8556,7 @@
           <w:szCs w:val="22"/>
         </w:rPr>
         <w:drawing>
-          <wp:inline distT="0" distB="0" distL="0" distR="0" wp14:anchorId="6142BFF3" wp14:editId="50AFADCC">
+          <wp:inline distT="0" distB="0" distL="0" distR="0" wp14:anchorId="6142BFF3" wp14:editId="33302214">
             <wp:extent cx="5397500" cy="3078936"/>
             <wp:effectExtent l="0" t="0" r="0" b="7620"/>
             <wp:docPr id="1046379083" name="Picture 1"/>
@@ -10297,7 +10297,7 @@
           <w:sz w:val="22"/>
           <w:szCs w:val="22"/>
         </w:rPr>
-        <w:t>Un usuario olvidó su contraseña.</w:t>
+        <w:t>Un usuario olvidó su contraseña (el número de contacto se configura en la clave ContactoRecuperacion del archivo Edelstahl.WinApp.exe.config).</w:t>
       </w:r>
     </w:p>
     <w:p>
@@ -10370,7 +10370,16 @@
           <w:sz w:val="22"/>
           <w:szCs w:val="22"/>
         </w:rPr>
-        <w:t>En la pantalla de inicio de sesión, el usuario puede tocar “Forgot your password?”, que le indica estos pasos. Un administrador inicia sesión y abre Administración, pestaña Users.</w:t>
+        <w:t>En la pantalla de inicio de sesión, el usuario toca “Recover password” y ve el número de WhatsApp de contacto. Un administrador</w:t>
+      </w:r>
+      <w:r>
+        <w:rPr>
+          <w:rFonts w:ascii="Calibri" w:eastAsia="Times New Roman" w:hAnsi="Calibri" w:cs="Calibri"/>
+          <w:color w:val="1C2430"/>
+          <w:sz w:val="22"/>
+          <w:szCs w:val="22"/>
+        </w:rPr>
+        <w:t xml:space="preserve"> inicia sesión y abre Administración, pestaña Users.</w:t>
       </w:r>
     </w:p>
     <w:p>

</xml_diff>

<commit_message>
Recover password: se agrega el correo de contacto (configurable en App.config); instalador 1.0.4
Co-Authored-By: Claude Sonnet 5.5 <noreply@anthropic.com>
</commit_message>
<xml_diff>
--- a/8 - Codigo Fuente/Edelstahl-ERP/Documentacion/Manuales/Manual-de-instalacion.docx
+++ b/8 - Codigo Fuente/Edelstahl-ERP/Documentacion/Manuales/Manual-de-instalacion.docx
@@ -5861,7 +5861,6 @@
           <w:sz w:val="22"/>
           <w:szCs w:val="22"/>
         </w:rPr>
-        <w:lastRenderedPageBreak/>
         <w:t xml:space="preserve">Verificá en </w:t>
       </w:r>
       <w:r>
@@ -6748,7 +6747,6 @@
                 <w:sz w:val="20"/>
                 <w:szCs w:val="20"/>
               </w:rPr>
-              <w:lastRenderedPageBreak/>
               <w:t>BaseNegocio</w:t>
             </w:r>
           </w:p>
@@ -7663,7 +7661,6 @@
           <w:sz w:val="22"/>
           <w:szCs w:val="22"/>
         </w:rPr>
-        <w:lastRenderedPageBreak/>
         <w:t>Doble clic en el acceso directo.</w:t>
       </w:r>
     </w:p>
@@ -7932,7 +7929,6 @@
           <w:sz w:val="22"/>
           <w:szCs w:val="22"/>
         </w:rPr>
-        <w:lastRenderedPageBreak/>
         <w:drawing>
           <wp:inline distT="0" distB="0" distL="0" distR="0" wp14:anchorId="1E0B4401" wp14:editId="098E1BDE">
             <wp:extent cx="3175000" cy="3022940"/>
@@ -8271,7 +8267,6 @@
         <w:rPr>
           <w:rFonts w:ascii="Calibri" w:eastAsia="Times New Roman" w:hAnsi="Calibri" w:cs="Calibri"/>
         </w:rPr>
-        <w:lastRenderedPageBreak/>
         <w:t>9. Verificación de la instalación</w:t>
       </w:r>
     </w:p>
@@ -8556,7 +8551,7 @@
           <w:szCs w:val="22"/>
         </w:rPr>
         <w:drawing>
-          <wp:inline distT="0" distB="0" distL="0" distR="0" wp14:anchorId="6142BFF3" wp14:editId="33302214">
+          <wp:inline distT="0" distB="0" distL="0" distR="0" wp14:anchorId="6142BFF3" wp14:editId="0F8F788A">
             <wp:extent cx="5397500" cy="3078936"/>
             <wp:effectExtent l="0" t="0" r="0" b="7620"/>
             <wp:docPr id="1046379083" name="Picture 1"/>
@@ -8757,7 +8752,6 @@
         <w:rPr>
           <w:rFonts w:ascii="Calibri" w:eastAsia="Times New Roman" w:hAnsi="Calibri" w:cs="Calibri"/>
         </w:rPr>
-        <w:lastRenderedPageBreak/>
         <w:t>9.3. Verificación de los archivos</w:t>
       </w:r>
     </w:p>
@@ -9509,7 +9503,6 @@
         <w:rPr>
           <w:rFonts w:ascii="Calibri" w:eastAsia="Times New Roman" w:hAnsi="Calibri" w:cs="Calibri"/>
         </w:rPr>
-        <w:lastRenderedPageBreak/>
         <w:t>10.4. El programa no se abre, o se cierra apenas se ejecuta</w:t>
       </w:r>
     </w:p>
@@ -10139,7 +10132,6 @@
         <w:rPr>
           <w:rFonts w:ascii="Calibri" w:eastAsia="Times New Roman" w:hAnsi="Calibri" w:cs="Calibri"/>
         </w:rPr>
-        <w:lastRenderedPageBreak/>
         <w:t>10.8. No puedo abrir el archivo de respaldo (.bak)</w:t>
       </w:r>
     </w:p>
@@ -10297,7 +10289,25 @@
           <w:sz w:val="22"/>
           <w:szCs w:val="22"/>
         </w:rPr>
-        <w:t>Un usuario olvidó su contraseña (el número de contacto se configura en la clave ContactoRecuperacion del archivo Edelstahl.WinApp.exe.config).</w:t>
+        <w:t xml:space="preserve">Un usuario olvidó su contraseña </w:t>
+      </w:r>
+      <w:r>
+        <w:rPr>
+          <w:rFonts w:ascii="Calibri" w:eastAsia="Times New Roman" w:hAnsi="Calibri" w:cs="Calibri"/>
+          <w:color w:val="1C2430"/>
+          <w:sz w:val="22"/>
+          <w:szCs w:val="22"/>
+        </w:rPr>
+        <w:t>(el número y el correo de contacto se configuran en las claves ContactoRecuperacion y ContactoCorreo del archivo Edelstahl.WinApp.exe.config)</w:t>
+      </w:r>
+      <w:r>
+        <w:rPr>
+          <w:rFonts w:ascii="Calibri" w:eastAsia="Times New Roman" w:hAnsi="Calibri" w:cs="Calibri"/>
+          <w:color w:val="1C2430"/>
+          <w:sz w:val="22"/>
+          <w:szCs w:val="22"/>
+        </w:rPr>
+        <w:t>.</w:t>
       </w:r>
     </w:p>
     <w:p>
@@ -10705,7 +10715,6 @@
         <w:rPr>
           <w:rFonts w:ascii="Calibri" w:eastAsia="Times New Roman" w:hAnsi="Calibri" w:cs="Calibri"/>
         </w:rPr>
-        <w:lastRenderedPageBreak/>
         <w:t>11.1. Desinstalar Edelstahl ERP</w:t>
       </w:r>
     </w:p>
@@ -11370,7 +11379,6 @@
         <w:rPr>
           <w:rFonts w:ascii="Calibri" w:eastAsia="Times New Roman" w:hAnsi="Calibri" w:cs="Calibri"/>
         </w:rPr>
-        <w:lastRenderedPageBreak/>
         <w:t>14. Resumen de pasos de instalación</w:t>
       </w:r>
     </w:p>

</xml_diff>

<commit_message>
Recuperar contrasena con pregunta de seguridad, Mi perfil, pedir ayuda al administrador, boton Ayuda (.chm) y Cerrar sesion; instalador 1.1.0 y manuales
La pregunta se elige en Mi perfil (o la define el administrador); la respuesta se guarda como hash. El pedido de ayuda queda en la bitacora segun el perfil del usuario.

Co-Authored-By: Claude Sonnet 5.5 <noreply@anthropic.com>
</commit_message>
<xml_diff>
--- a/8 - Codigo Fuente/Edelstahl-ERP/Documentacion/Manuales/Manual-de-instalacion.docx
+++ b/8 - Codigo Fuente/Edelstahl-ERP/Documentacion/Manuales/Manual-de-instalacion.docx
@@ -5861,6 +5861,7 @@
           <w:sz w:val="22"/>
           <w:szCs w:val="22"/>
         </w:rPr>
+        <w:lastRenderedPageBreak/>
         <w:t xml:space="preserve">Verificá en </w:t>
       </w:r>
       <w:r>
@@ -8551,7 +8552,7 @@
           <w:szCs w:val="22"/>
         </w:rPr>
         <w:drawing>
-          <wp:inline distT="0" distB="0" distL="0" distR="0" wp14:anchorId="6142BFF3" wp14:editId="0F8F788A">
+          <wp:inline distT="0" distB="0" distL="0" distR="0" wp14:anchorId="6142BFF3" wp14:editId="22C20205">
             <wp:extent cx="5397500" cy="3078936"/>
             <wp:effectExtent l="0" t="0" r="0" b="7620"/>
             <wp:docPr id="1046379083" name="Picture 1"/>
@@ -10289,25 +10290,7 @@
           <w:sz w:val="22"/>
           <w:szCs w:val="22"/>
         </w:rPr>
-        <w:t xml:space="preserve">Un usuario olvidó su contraseña </w:t>
-      </w:r>
-      <w:r>
-        <w:rPr>
-          <w:rFonts w:ascii="Calibri" w:eastAsia="Times New Roman" w:hAnsi="Calibri" w:cs="Calibri"/>
-          <w:color w:val="1C2430"/>
-          <w:sz w:val="22"/>
-          <w:szCs w:val="22"/>
-        </w:rPr>
-        <w:t>(el número y el correo de contacto se configuran en las claves ContactoRecuperacion y ContactoCorreo del archivo Edelstahl.WinApp.exe.config)</w:t>
-      </w:r>
-      <w:r>
-        <w:rPr>
-          <w:rFonts w:ascii="Calibri" w:eastAsia="Times New Roman" w:hAnsi="Calibri" w:cs="Calibri"/>
-          <w:color w:val="1C2430"/>
-          <w:sz w:val="22"/>
-          <w:szCs w:val="22"/>
-        </w:rPr>
-        <w:t>.</w:t>
+        <w:t>Un usuario olvidó su contraseña. Si ya eligió su pregunta de seguridad (Mi perfil), puede cambiarla solo; si no, necesita al administrador. El número y el correo de contacto se configuran en las claves ContactoRecuperacion y ContactoCorreo de Edelstahl.WinApp.exe.config.</w:t>
       </w:r>
     </w:p>
     <w:p>
@@ -10380,16 +10363,7 @@
           <w:sz w:val="22"/>
           <w:szCs w:val="22"/>
         </w:rPr>
-        <w:t>En la pantalla de inicio de sesión, el usuario toca “Recover password” y ve el número de WhatsApp de contacto. Un administrador</w:t>
-      </w:r>
-      <w:r>
-        <w:rPr>
-          <w:rFonts w:ascii="Calibri" w:eastAsia="Times New Roman" w:hAnsi="Calibri" w:cs="Calibri"/>
-          <w:color w:val="1C2430"/>
-          <w:sz w:val="22"/>
-          <w:szCs w:val="22"/>
-        </w:rPr>
-        <w:t xml:space="preserve"> inicia sesión y abre Administración, pestaña Users.</w:t>
+        <w:t>Si el usuario eligió su pregunta de seguridad: en la pantalla de inicio de sesión toca "Recuperar contraseña", escribe su usuario, toca "Ver pregunta de seguridad", responde y elige una contraseña nueva. Esa pantalla también muestra los datos del administrador.</w:t>
       </w:r>
     </w:p>
     <w:p>
@@ -10415,7 +10389,7 @@
           <w:sz w:val="22"/>
           <w:szCs w:val="22"/>
         </w:rPr>
-        <w:t>Selecciona al usuario, elige Reset password y escribe una contraseña provisoria dos veces (mínimo 8 caracteres). Esto también quita el bloqueo, si lo tenía.</w:t>
+        <w:t>Si no puede, un administrador inicia sesión, abre Administración, pestaña Users, selecciona al usuario, elige Reset password y escribe una contraseña provisoria dos veces (mínimo 8 caracteres). Esto también quita el bloqueo, si lo tenía.</w:t>
       </w:r>
     </w:p>
     <w:p>

</xml_diff>